<commit_message>
prepare for submission, fix names
</commit_message>
<xml_diff>
--- a/Hw3/HW3G1Tasklist.docx
+++ b/Hw3/HW3G1Tasklist.docx
@@ -16,7 +16,7 @@
         <w:rPr>
           <w:u w:val="single"/>
         </w:rPr>
-        <w:t>3</w:t>
+        <w:t>4</w:t>
       </w:r>
     </w:p>
     <w:p>
@@ -26,18 +26,33 @@
         </w:rPr>
       </w:pPr>
       <w:r>
-        <w:t xml:space="preserve">Class:  </w:t>
+        <w:t>Class</w:t>
+      </w:r>
+      <w:proofErr w:type="gramStart"/>
+      <w:r>
+        <w:t xml:space="preserve">:  </w:t>
       </w:r>
       <w:r>
         <w:rPr>
           <w:u w:val="single"/>
         </w:rPr>
-        <w:t>Language Translation</w:t>
+        <w:t>Language</w:t>
+      </w:r>
+      <w:proofErr w:type="gramEnd"/>
+      <w:r>
+        <w:rPr>
+          <w:u w:val="single"/>
+        </w:rPr>
+        <w:t xml:space="preserve"> Translation</w:t>
       </w:r>
     </w:p>
     <w:p>
       <w:r>
-        <w:t xml:space="preserve">Group number:  </w:t>
+        <w:t>Group number</w:t>
+      </w:r>
+      <w:proofErr w:type="gramStart"/>
+      <w:r>
+        <w:t xml:space="preserve">:  </w:t>
       </w:r>
       <w:r>
         <w:rPr>
@@ -45,6 +60,7 @@
         </w:rPr>
         <w:t>1</w:t>
       </w:r>
+      <w:proofErr w:type="gramEnd"/>
     </w:p>
     <w:tbl>
       <w:tblPr>
@@ -183,7 +199,15 @@
           </w:tcPr>
           <w:p>
             <w:r>
-              <w:t>Another look over of Q1 and Q2</w:t>
+              <w:t xml:space="preserve">Another </w:t>
+            </w:r>
+            <w:proofErr w:type="gramStart"/>
+            <w:r>
+              <w:t>look</w:t>
+            </w:r>
+            <w:proofErr w:type="gramEnd"/>
+            <w:r>
+              <w:t xml:space="preserve"> over of Q1 and Q2</w:t>
             </w:r>
           </w:p>
         </w:tc>

</xml_diff>